<commit_message>
Update docs to reflect the production deployment and OTP-delivery fixes
Reflects everything from standing up the live Render/Netlify deployment
this session: production topology and URLs, the tsconfig/dist-path build
bug, the TOTP bootstrap for the three demo accounts, and the full
registration-OTP saga — unconfigured providers, the Render free-tier
SMTP port block discovery, the Brevo HTTP API rewrite, and the
Promise.allSettled fix for the orphaned-account crash. Both OTP channels
are now confirmed live and working, so incident #2 and roadmap §17.5 are
updated from "open/blocking" to "resolved."

Co-Authored-By: Claude Sonnet 5 <noreply@anthropic.com>
</commit_message>
<xml_diff>
--- a/docs/00-documentation-index.docx
+++ b/docs/00-documentation-index.docx
@@ -1476,10 +1476,119 @@
         <w:rPr>
           <w:b/>
         </w:rPr>
-        <w:t>No deployed environment exists yet.</w:t>
+        <w:t>Production exists now</w:t>
       </w:r>
       <w:r>
-        <w:t xml:space="preserve"> Local development is the only environment. Every "not implemented" marker for staging/production/CI/monitoring/backups traces back to this one fact, not to independent oversights.</w:t>
+        <w:t xml:space="preserve"> — </w:t>
+      </w:r>
+      <w:r>
+        <w:rPr>
+          <w:rFonts w:ascii="Consolas" w:hAnsi="Consolas"/>
+          <w:sz w:val="20"/>
+        </w:rPr>
+        <w:t>api</w:t>
+      </w:r>
+      <w:r>
+        <w:t xml:space="preserve"> (Render), </w:t>
+      </w:r>
+      <w:r>
+        <w:rPr>
+          <w:rFonts w:ascii="Consolas" w:hAnsi="Consolas"/>
+          <w:sz w:val="20"/>
+        </w:rPr>
+        <w:t>storefront</w:t>
+      </w:r>
+      <w:r>
+        <w:t xml:space="preserve">, and </w:t>
+      </w:r>
+      <w:r>
+        <w:rPr>
+          <w:rFonts w:ascii="Consolas" w:hAnsi="Consolas"/>
+          <w:sz w:val="20"/>
+        </w:rPr>
+        <w:t>admin</w:t>
+      </w:r>
+      <w:r>
+        <w:t xml:space="preserve"> (both Netlify) are live and auto-deploy on push to </w:t>
+      </w:r>
+      <w:r>
+        <w:rPr>
+          <w:rFonts w:ascii="Consolas" w:hAnsi="Consolas"/>
+          <w:sz w:val="20"/>
+        </w:rPr>
+        <w:t>main</w:t>
+      </w:r>
+      <w:r>
+        <w:t xml:space="preserve">; see </w:t>
+      </w:r>
+      <w:hyperlink r:id="rId20">
+        <w:r>
+          <w:rPr>
+            <w:color w:val="0563C1"/>
+            <w:u w:val="single"/>
+          </w:rPr>
+          <w:t xml:space="preserve">`11`</w:t>
+        </w:r>
+      </w:hyperlink>
+      <w:r>
+        <w:t xml:space="preserve"> for URLs and config, </w:t>
+      </w:r>
+      <w:hyperlink r:id="rId11">
+        <w:r>
+          <w:rPr>
+            <w:color w:val="0563C1"/>
+            <w:u w:val="single"/>
+          </w:rPr>
+          <w:t xml:space="preserve">`02`</w:t>
+        </w:r>
+      </w:hyperlink>
+      <w:r>
+        <w:t xml:space="preserve"> for the topology. No </w:t>
+      </w:r>
+      <w:r>
+        <w:rPr>
+          <w:b/>
+        </w:rPr>
+        <w:t>staging</w:t>
+      </w:r>
+      <w:r>
+        <w:t xml:space="preserve"> environment exists yet, and no CI pipeline gates the auto-deploy — those two gaps, plus monitoring/backups, are what the remaining "not implemented" markers throughout this doc set actually refer to now, not the absence of production itself. Two real production issues are open: registration OTP delivery is non-functional (no SMTP/SMS provider configured — see </w:t>
+      </w:r>
+      <w:hyperlink r:id="rId16">
+        <w:r>
+          <w:rPr>
+            <w:color w:val="0563C1"/>
+            <w:u w:val="single"/>
+          </w:rPr>
+          <w:t xml:space="preserve">`07`</w:t>
+        </w:r>
+      </w:hyperlink>
+      <w:r>
+        <w:t xml:space="preserve"> and </w:t>
+      </w:r>
+      <w:hyperlink r:id="rId22">
+        <w:r>
+          <w:rPr>
+            <w:color w:val="0563C1"/>
+            <w:u w:val="single"/>
+          </w:rPr>
+          <w:t xml:space="preserve">`13`</w:t>
+        </w:r>
+      </w:hyperlink>
+      <w:r>
+        <w:t xml:space="preserve">), and the free-tier Postgres instance expires 90 days after creation unless upgraded (see </w:t>
+      </w:r>
+      <w:hyperlink r:id="rId20">
+        <w:r>
+          <w:rPr>
+            <w:color w:val="0563C1"/>
+            <w:u w:val="single"/>
+          </w:rPr>
+          <w:t xml:space="preserve">`11`</w:t>
+        </w:r>
+      </w:hyperlink>
+      <w:r>
+        <w:t>).</w:t>
       </w:r>
     </w:p>
     <w:p>

</xml_diff>

<commit_message>
Log the checkout redirect bug and confirm the Netlify bug is account-wide
Incident #6: POST /checkout's response shape (order nested, not flat)
vs. the frontend reading body.id instead of body.order.id, sending
customers to /orders/undefined after every successful order. Fixed in
56d9b4f. Also updates incident #5 now that a second, unrelated deploy
(this fix) hit the identical Netlify rejection, confirming the stuck
credit-usage-exceeded flag blocks storefront deploys too, not just admin.

Co-Authored-By: Claude Sonnet 5 <noreply@anthropic.com>
</commit_message>
<xml_diff>
--- a/docs/00-documentation-index.docx
+++ b/docs/00-documentation-index.docx
@@ -2626,7 +2626,7 @@
         <w:t>Netlify "Account credit usage exceeded" platform bug</w:t>
       </w:r>
       <w:r>
-        <w:t xml:space="preserve"> — a live admin-site deploy was blocked by this error despite the account's own API showing </w:t>
+        <w:t xml:space="preserve"> — confirmed account-wide (blocks both admin and storefront deploys), despite the account's own API showing </w:t>
       </w:r>
       <w:r>
         <w:rPr>
@@ -2648,7 +2648,83 @@
         </w:r>
       </w:hyperlink>
       <w:r>
-        <w:t>'s incident log for the forum references and current status.</w:t>
+        <w:t>'s incident log for the forum references and current status. Any fix pushed while this is open is real and correct in the repo but not yet visible on the live sites — check incident #5's status before assuming a shipped fix is actually live.</w:t>
+      </w:r>
+    </w:p>
+    <w:p>
+      <w:pPr>
+        <w:pStyle w:val="ListBullet"/>
+      </w:pPr>
+      <w:r>
+        <w:rPr>
+          <w:b/>
+        </w:rPr>
+        <w:t>Checkout redirect bug (fixed in code, not yet live — see above)</w:t>
+      </w:r>
+      <w:r>
+        <w:t xml:space="preserve"> — </w:t>
+      </w:r>
+      <w:r>
+        <w:rPr>
+          <w:rFonts w:ascii="Consolas" w:hAnsi="Consolas"/>
+          <w:sz w:val="20"/>
+        </w:rPr>
+        <w:t>POST /checkout</w:t>
+      </w:r>
+      <w:r>
+        <w:t xml:space="preserve"> returns </w:t>
+      </w:r>
+      <w:r>
+        <w:rPr>
+          <w:rFonts w:ascii="Consolas" w:hAnsi="Consolas"/>
+          <w:sz w:val="20"/>
+        </w:rPr>
+        <w:t>{ order, checkoutUrl }</w:t>
+      </w:r>
+      <w:r>
+        <w:t xml:space="preserve">; the post-submit redirect read </w:t>
+      </w:r>
+      <w:r>
+        <w:rPr>
+          <w:rFonts w:ascii="Consolas" w:hAnsi="Consolas"/>
+          <w:sz w:val="20"/>
+        </w:rPr>
+        <w:t>body.id</w:t>
+      </w:r>
+      <w:r>
+        <w:t xml:space="preserve"> instead of </w:t>
+      </w:r>
+      <w:r>
+        <w:rPr>
+          <w:rFonts w:ascii="Consolas" w:hAnsi="Consolas"/>
+          <w:sz w:val="20"/>
+        </w:rPr>
+        <w:t>body.order.id</w:t>
+      </w:r>
+      <w:r>
+        <w:t xml:space="preserve">, sending customers to </w:t>
+      </w:r>
+      <w:r>
+        <w:rPr>
+          <w:rFonts w:ascii="Consolas" w:hAnsi="Consolas"/>
+          <w:sz w:val="20"/>
+        </w:rPr>
+        <w:t>/orders/undefined</w:t>
+      </w:r>
+      <w:r>
+        <w:t xml:space="preserve"> and a false "Order not found" after every successful Cash-on-Delivery order. The order itself was always placed correctly — see </w:t>
+      </w:r>
+      <w:hyperlink r:id="rId22">
+        <w:r>
+          <w:rPr>
+            <w:color w:val="0563C1"/>
+            <w:u w:val="single"/>
+          </w:rPr>
+          <w:t xml:space="preserve">`13`</w:t>
+        </w:r>
+      </w:hyperlink>
+      <w:r>
+        <w:t xml:space="preserve"> incident #6.</w:t>
       </w:r>
     </w:p>
     <w:p>

</xml_diff>

<commit_message>
Document the Driver App across the doc set
00-index: cross-cutting note on the new DRIVER role/Delivery model and
its Netlify-blocked frontend status. 03-database-design: Delivery added
to the schema inventory, DRIVER role noted. 07-authentication-and-
authorization: DRIVER's RBAC boundary (own-deliveries only, assignment
gated same as order management). 16-user-and-administrator-procedures:
full assign/pickup/deliver walkthrough for both admin and driver sides.

21/22/23 (DFD/ERD/Data Dictionary) updated in .md with the new Delivery
model, DeliveryStatus enum, DRIVER role, and a new Level-1 diagram — but
NOT regenerated to .docx, since those three files are currently open in
a desktop word processor (lock files present). Regenerate once closed.

Co-Authored-By: Claude Sonnet 5 <noreply@anthropic.com>
</commit_message>
<xml_diff>
--- a/docs/00-documentation-index.docx
+++ b/docs/00-documentation-index.docx
@@ -2735,6 +2735,142 @@
         <w:rPr>
           <w:b/>
         </w:rPr>
+        <w:t>Driver App</w:t>
+      </w:r>
+      <w:r>
+        <w:t xml:space="preserve"> (commit </w:t>
+      </w:r>
+      <w:r>
+        <w:rPr>
+          <w:rFonts w:ascii="Consolas" w:hAnsi="Consolas"/>
+          <w:sz w:val="20"/>
+        </w:rPr>
+        <w:t>75b7cff</w:t>
+      </w:r>
+      <w:r>
+        <w:t xml:space="preserve">, per user request, not in the original SRS) — a new </w:t>
+      </w:r>
+      <w:r>
+        <w:rPr>
+          <w:rFonts w:ascii="Consolas" w:hAnsi="Consolas"/>
+          <w:sz w:val="20"/>
+        </w:rPr>
+        <w:t>DRIVER</w:t>
+      </w:r>
+      <w:r>
+        <w:t xml:space="preserve"> staff role, </w:t>
+      </w:r>
+      <w:r>
+        <w:rPr>
+          <w:rFonts w:ascii="Consolas" w:hAnsi="Consolas"/>
+          <w:sz w:val="20"/>
+        </w:rPr>
+        <w:t>Delivery</w:t>
+      </w:r>
+      <w:r>
+        <w:t xml:space="preserve"> model (1:1 with </w:t>
+      </w:r>
+      <w:r>
+        <w:rPr>
+          <w:rFonts w:ascii="Consolas" w:hAnsi="Consolas"/>
+          <w:sz w:val="20"/>
+        </w:rPr>
+        <w:t>Order</w:t>
+      </w:r>
+      <w:r>
+        <w:t xml:space="preserve">, GPS pickup/delivery capture + timestamps, deep-linked to Google Maps rather than an in-app map), and an admin-console "My Deliveries" section for drivers. Backend is fully live in production (migrated and verified); the admin/storefront UI pieces (assign-driver, delivery status on the order/receipt views, My Deliveries) are code-complete but blocked from reaching the live sites by the still-open Netlify issue above. See </w:t>
+      </w:r>
+      <w:hyperlink r:id="rId12">
+        <w:r>
+          <w:rPr>
+            <w:color w:val="0563C1"/>
+            <w:u w:val="single"/>
+          </w:rPr>
+          <w:t xml:space="preserve">`03`</w:t>
+        </w:r>
+      </w:hyperlink>
+      <w:r>
+        <w:t xml:space="preserve">, </w:t>
+      </w:r>
+      <w:hyperlink r:id="rId16">
+        <w:r>
+          <w:rPr>
+            <w:color w:val="0563C1"/>
+            <w:u w:val="single"/>
+          </w:rPr>
+          <w:t xml:space="preserve">`07`</w:t>
+        </w:r>
+      </w:hyperlink>
+      <w:r>
+        <w:t xml:space="preserve">, and </w:t>
+      </w:r>
+      <w:hyperlink r:id="rId25">
+        <w:r>
+          <w:rPr>
+            <w:color w:val="0563C1"/>
+            <w:u w:val="single"/>
+          </w:rPr>
+          <w:t xml:space="preserve">`16`</w:t>
+        </w:r>
+      </w:hyperlink>
+      <w:r>
+        <w:t xml:space="preserve"> for the model, RBAC, and usage walkthrough respectively — </w:t>
+      </w:r>
+      <w:hyperlink r:id="rId30">
+        <w:r>
+          <w:rPr>
+            <w:color w:val="0563C1"/>
+            <w:u w:val="single"/>
+          </w:rPr>
+          <w:t xml:space="preserve">`21`</w:t>
+        </w:r>
+      </w:hyperlink>
+      <w:r>
+        <w:t xml:space="preserve">, </w:t>
+      </w:r>
+      <w:hyperlink r:id="rId31">
+        <w:r>
+          <w:rPr>
+            <w:color w:val="0563C1"/>
+            <w:u w:val="single"/>
+          </w:rPr>
+          <w:t xml:space="preserve">`22`</w:t>
+        </w:r>
+      </w:hyperlink>
+      <w:r>
+        <w:t xml:space="preserve">, and </w:t>
+      </w:r>
+      <w:hyperlink r:id="rId32">
+        <w:r>
+          <w:rPr>
+            <w:color w:val="0563C1"/>
+            <w:u w:val="single"/>
+          </w:rPr>
+          <w:t xml:space="preserve">`23`</w:t>
+        </w:r>
+      </w:hyperlink>
+      <w:r>
+        <w:t xml:space="preserve"> predate this feature and have not been regenerated (their </w:t>
+      </w:r>
+      <w:r>
+        <w:rPr>
+          <w:rFonts w:ascii="Consolas" w:hAnsi="Consolas"/>
+          <w:sz w:val="20"/>
+        </w:rPr>
+        <w:t>.docx</w:t>
+      </w:r>
+      <w:r>
+        <w:t xml:space="preserve"> files were open in a desktop word processor at the time — see the note on those three documents' own freshness dates).</w:t>
+      </w:r>
+    </w:p>
+    <w:p>
+      <w:pPr>
+        <w:pStyle w:val="ListBullet"/>
+      </w:pPr>
+      <w:r>
+        <w:rPr>
+          <w:b/>
+        </w:rPr>
         <w:t>Three near-term priorities</w:t>
       </w:r>
       <w:r>

</xml_diff>

<commit_message>
Document the delivery-services MVP additions and explicitly deferred scope
00-index, 03-database-design, 16-user-and-administrator-procedures
(regenerated to .docx), plus 21/22/23 (DFD/ERD/Data Dictionary, .md only
— 21 and 22's .docx are still open in a desktop word processor).

Covers: User.driverStatus, Delivery.priority, the customer-notification
wiring (Brevo/Africa's Talking at ASSIGNED/PICKED_UP/DELIVERED/FAILED),
and the admin Dashboard's new Active Deliveries panel. 16's Driver App
section gets a new "Deliberately not built" list (route optimization,
live in-app maps, automatic dispatch, driver earnings/commission,
surge pricing, QR scanning, fraud detection) so a future ask to add any
of them starts from an explicit decision, not a silent assumption.

Co-Authored-By: Claude Sonnet 5 <noreply@anthropic.com>
</commit_message>
<xml_diff>
--- a/docs/00-documentation-index.docx
+++ b/docs/00-documentation-index.docx
@@ -2735,10 +2735,10 @@
         <w:rPr>
           <w:b/>
         </w:rPr>
-        <w:t>Driver App</w:t>
+        <w:t>Driver App / delivery-services MVP</w:t>
       </w:r>
       <w:r>
-        <w:t xml:space="preserve"> (commit </w:t>
+        <w:t xml:space="preserve"> (commits </w:t>
       </w:r>
       <w:r>
         <w:rPr>
@@ -2746,6 +2746,16 @@
           <w:sz w:val="20"/>
         </w:rPr>
         <w:t>75b7cff</w:t>
+      </w:r>
+      <w:r>
+        <w:t xml:space="preserve"> then </w:t>
+      </w:r>
+      <w:r>
+        <w:rPr>
+          <w:rFonts w:ascii="Consolas" w:hAnsi="Consolas"/>
+          <w:sz w:val="20"/>
+        </w:rPr>
+        <w:t>445a258</w:t>
       </w:r>
       <w:r>
         <w:t xml:space="preserve">, per user request, not in the original SRS) — a new </w:t>
@@ -2778,7 +2788,39 @@
         <w:t>Order</w:t>
       </w:r>
       <w:r>
-        <w:t xml:space="preserve">, GPS pickup/delivery capture + timestamps, deep-linked to Google Maps rather than an in-app map), and an admin-console "My Deliveries" section for drivers. Backend is fully live in production (migrated and verified); the admin/storefront UI pieces (assign-driver, delivery status on the order/receipt views, My Deliveries) are code-complete but blocked from reaching the live sites by the still-open Netlify issue above. See </w:t>
+        <w:t xml:space="preserve">, GPS pickup/delivery capture + timestamps + </w:t>
+      </w:r>
+      <w:r>
+        <w:rPr>
+          <w:rFonts w:ascii="Consolas" w:hAnsi="Consolas"/>
+          <w:sz w:val="20"/>
+        </w:rPr>
+        <w:t>priority</w:t>
+      </w:r>
+      <w:r>
+        <w:t xml:space="preserve">, deep-linked to Google Maps rather than an in-app map), </w:t>
+      </w:r>
+      <w:r>
+        <w:rPr>
+          <w:rFonts w:ascii="Consolas" w:hAnsi="Consolas"/>
+          <w:sz w:val="20"/>
+        </w:rPr>
+        <w:t>User.driverStatus</w:t>
+      </w:r>
+      <w:r>
+        <w:t xml:space="preserve"> (self-reported availability), real customer notifications at each delivery milestone (via the already-live Brevo/Africa's Talking services), an admin Dashboard "Active Deliveries" panel, and an admin-console "My Deliveries" section for drivers. Route optimization, live in-app maps, automatic dispatch, driver earnings/ commission, surge pricing, QR scanning, and fraud detection were explicitly scoped out — see </w:t>
+      </w:r>
+      <w:hyperlink r:id="rId25">
+        <w:r>
+          <w:rPr>
+            <w:color w:val="0563C1"/>
+            <w:u w:val="single"/>
+          </w:rPr>
+          <w:t xml:space="preserve">`16`</w:t>
+        </w:r>
+      </w:hyperlink>
+      <w:r>
+        <w:t xml:space="preserve">'s "Deliberately not built" list for why each one. Backend is fully live in production (both migrations applied and verified); the admin/storefront UI pieces are code-complete but blocked from reaching the live sites by the still-open Netlify issue above. See </w:t>
       </w:r>
       <w:hyperlink r:id="rId12">
         <w:r>
@@ -2850,7 +2892,17 @@
         </w:r>
       </w:hyperlink>
       <w:r>
-        <w:t xml:space="preserve"> predate this feature and have not been regenerated (their </w:t>
+        <w:t xml:space="preserve"> have been updated in </w:t>
+      </w:r>
+      <w:r>
+        <w:rPr>
+          <w:rFonts w:ascii="Consolas" w:hAnsi="Consolas"/>
+          <w:sz w:val="20"/>
+        </w:rPr>
+        <w:t>.md</w:t>
+      </w:r>
+      <w:r>
+        <w:t xml:space="preserve"> to match but two of the three still have unregenerated </w:t>
       </w:r>
       <w:r>
         <w:rPr>
@@ -2860,7 +2912,7 @@
         <w:t>.docx</w:t>
       </w:r>
       <w:r>
-        <w:t xml:space="preserve"> files were open in a desktop word processor at the time — see the note on those three documents' own freshness dates).</w:t>
+        <w:t xml:space="preserve"> files (open in a desktop word processor as of this writing — see those documents' own freshness notes for current status).</w:t>
       </w:r>
     </w:p>
     <w:p>

</xml_diff>

<commit_message>
Document the receipt stamp date+time change
docs/SRS.md's "virtual stamp" note and the storefront user manual both
described the stamp as date-only — updated to match commit 14d851b.
19-storefront-user-manual.md and SRS.md are .md-only (their .docx files
are open in a desktop word processor); 00-index regenerated to .docx.

Co-Authored-By: Claude Sonnet 5 <noreply@anthropic.com>
</commit_message>
<xml_diff>
--- a/docs/00-documentation-index.docx
+++ b/docs/00-documentation-index.docx
@@ -2923,6 +2923,72 @@
         <w:rPr>
           <w:b/>
         </w:rPr>
+        <w:t>Receipt stamp now shows date and time</w:t>
+      </w:r>
+      <w:r>
+        <w:t xml:space="preserve"> (commit </w:t>
+      </w:r>
+      <w:r>
+        <w:rPr>
+          <w:rFonts w:ascii="Consolas" w:hAnsi="Consolas"/>
+          <w:sz w:val="20"/>
+        </w:rPr>
+        <w:t>14d851b</w:t>
+      </w:r>
+      <w:r>
+        <w:t xml:space="preserve">, per user request) — the "RECEIVED IN GOOD CONDITION" seal on both the customer's and staff's printable receipt previously showed only the confirmation date; both now show the hour too. See </w:t>
+      </w:r>
+      <w:r>
+        <w:rPr>
+          <w:rFonts w:ascii="Consolas" w:hAnsi="Consolas"/>
+          <w:sz w:val="20"/>
+        </w:rPr>
+        <w:t>docs/SRS.md</w:t>
+      </w:r>
+      <w:r>
+        <w:t xml:space="preserve">'s "virtual stamp" note and </w:t>
+      </w:r>
+      <w:hyperlink r:id="rId28">
+        <w:r>
+          <w:rPr>
+            <w:color w:val="0563C1"/>
+            <w:u w:val="single"/>
+          </w:rPr>
+          <w:t xml:space="preserve">`19-storefront-user-manual.md`</w:t>
+        </w:r>
+      </w:hyperlink>
+      <w:r>
+        <w:t xml:space="preserve"> (both updated in </w:t>
+      </w:r>
+      <w:r>
+        <w:rPr>
+          <w:rFonts w:ascii="Consolas" w:hAnsi="Consolas"/>
+          <w:sz w:val="20"/>
+        </w:rPr>
+        <w:t>.md</w:t>
+      </w:r>
+      <w:r>
+        <w:t xml:space="preserve">; their </w:t>
+      </w:r>
+      <w:r>
+        <w:rPr>
+          <w:rFonts w:ascii="Consolas" w:hAnsi="Consolas"/>
+          <w:sz w:val="20"/>
+        </w:rPr>
+        <w:t>.docx</w:t>
+      </w:r>
+      <w:r>
+        <w:t>s are among the ones currently open, per the note above).</w:t>
+      </w:r>
+    </w:p>
+    <w:p>
+      <w:pPr>
+        <w:pStyle w:val="ListBullet"/>
+      </w:pPr>
+      <w:r>
+        <w:rPr>
+          <w:b/>
+        </w:rPr>
         <w:t>Three near-term priorities</w:t>
       </w:r>
       <w:r>

</xml_diff>

<commit_message>
Document admin-managed shipping zones across the doc set
Covers the new destination + delivery-method shipping pricing
(commit 7e197b9): SRS FR-5.4a, the new ShippingZone model in the
database design/data dictionary/ERD docs, the new /admin/shipping-zones
and /shipping/quote endpoints in the API doc, an admin runbook section
and quick-reference/feature-availability rows in the admin manual, the
storefront manual's updated checkout walkthrough, and the checkout
request-flow description in the system architecture doc. Also fixes
two small pre-existing staleness gaps noticed along the way: the admin
manual's "sidebar has four sections" line (missing Deliveries) and the
backend-development doc's module list (missing delivery/shipping).
Regenerated every touched .md's .docx twin to match.

Co-Authored-By: Claude Sonnet 5 <noreply@anthropic.com>
</commit_message>
<xml_diff>
--- a/docs/00-documentation-index.docx
+++ b/docs/00-documentation-index.docx
@@ -2989,6 +2989,136 @@
         <w:rPr>
           <w:b/>
         </w:rPr>
+        <w:t>Admin-managed shipping zones</w:t>
+      </w:r>
+      <w:r>
+        <w:t xml:space="preserve"> (per user decision, not in the original SRS) — shipping used to be a flat fee per delivery method (Standard free, Express UGX 8,000, Same-day UGX 12,000) regardless of destination. A new </w:t>
+      </w:r>
+      <w:r>
+        <w:rPr>
+          <w:rFonts w:ascii="Consolas" w:hAnsi="Consolas"/>
+          <w:sz w:val="20"/>
+        </w:rPr>
+        <w:t>ShippingZone</w:t>
+      </w:r>
+      <w:r>
+        <w:t xml:space="preserve"> model (admin-editable towns list + per-</w:t>
+      </w:r>
+      <w:r>
+        <w:rPr>
+          <w:rFonts w:ascii="Consolas" w:hAnsi="Consolas"/>
+          <w:sz w:val="20"/>
+        </w:rPr>
+        <w:t>DeliveryMethod</w:t>
+      </w:r>
+      <w:r>
+        <w:t xml:space="preserve"> fee, one zone flagged </w:t>
+      </w:r>
+      <w:r>
+        <w:rPr>
+          <w:rFonts w:ascii="Consolas" w:hAnsi="Consolas"/>
+          <w:sz w:val="20"/>
+        </w:rPr>
+        <w:t>isDefault</w:t>
+      </w:r>
+      <w:r>
+        <w:t xml:space="preserve"> as the fallback for an unmatched city) replaces that flat table — </w:t>
+      </w:r>
+      <w:r>
+        <w:rPr>
+          <w:rFonts w:ascii="Consolas" w:hAnsi="Consolas"/>
+          <w:sz w:val="20"/>
+        </w:rPr>
+        <w:t>CheckoutService</w:t>
+      </w:r>
+      <w:r>
+        <w:t xml:space="preserve"> now matches the order's destination and charges that zone's rate, rejecting a delivery method the matched zone doesn't offer rather than silently mispricing it. Managed at Admin → Shipping Zones (</w:t>
+      </w:r>
+      <w:r>
+        <w:rPr>
+          <w:rFonts w:ascii="Consolas" w:hAnsi="Consolas"/>
+          <w:sz w:val="20"/>
+        </w:rPr>
+        <w:t>OWNER</w:t>
+      </w:r>
+      <w:r>
+        <w:t>/</w:t>
+      </w:r>
+      <w:r>
+        <w:rPr>
+          <w:rFonts w:ascii="Consolas" w:hAnsi="Consolas"/>
+          <w:sz w:val="20"/>
+        </w:rPr>
+        <w:t>STORE_MANAGER</w:t>
+      </w:r>
+      <w:r>
+        <w:t xml:space="preserve">); a public </w:t>
+      </w:r>
+      <w:r>
+        <w:rPr>
+          <w:rFonts w:ascii="Consolas" w:hAnsi="Consolas"/>
+          <w:sz w:val="20"/>
+        </w:rPr>
+        <w:t>GET /shipping/quote</w:t>
+      </w:r>
+      <w:r>
+        <w:t xml:space="preserve"> lets the storefront show live prices as the customer types their city. Per user decision, Same-day is priced higher outside Kampala rather than hard-blocked there. See FR-5.4a in </w:t>
+      </w:r>
+      <w:r>
+        <w:rPr>
+          <w:rFonts w:ascii="Consolas" w:hAnsi="Consolas"/>
+          <w:sz w:val="20"/>
+        </w:rPr>
+        <w:t>docs/SRS.md</w:t>
+      </w:r>
+      <w:r>
+        <w:t xml:space="preserve">, </w:t>
+      </w:r>
+      <w:hyperlink r:id="rId12">
+        <w:r>
+          <w:rPr>
+            <w:color w:val="0563C1"/>
+            <w:u w:val="single"/>
+          </w:rPr>
+          <w:t xml:space="preserve">`03`</w:t>
+        </w:r>
+      </w:hyperlink>
+      <w:r>
+        <w:t xml:space="preserve">, </w:t>
+      </w:r>
+      <w:hyperlink r:id="rId15">
+        <w:r>
+          <w:rPr>
+            <w:color w:val="0563C1"/>
+            <w:u w:val="single"/>
+          </w:rPr>
+          <w:t xml:space="preserve">`06`</w:t>
+        </w:r>
+      </w:hyperlink>
+      <w:r>
+        <w:t xml:space="preserve">, and </w:t>
+      </w:r>
+      <w:hyperlink r:id="rId25">
+        <w:r>
+          <w:rPr>
+            <w:color w:val="0563C1"/>
+            <w:u w:val="single"/>
+          </w:rPr>
+          <w:t xml:space="preserve">`16`</w:t>
+        </w:r>
+      </w:hyperlink>
+      <w:r>
+        <w:t>.</w:t>
+      </w:r>
+    </w:p>
+    <w:p>
+      <w:pPr>
+        <w:pStyle w:val="ListBullet"/>
+      </w:pPr>
+      <w:r>
+        <w:rPr>
+          <w:b/>
+        </w:rPr>
         <w:t>Three near-term priorities</w:t>
       </w:r>
       <w:r>

</xml_diff>

<commit_message>
Document region-based upcountry shipping pricing across the doc set
Covers commit c917b38's seed-data change: SRS FR-5.4a, the database
design/data dictionary/ERD freshness notes and summaries, the admin
manual's Shipping Zones section, and the operational runbook's setup
walkthrough all now describe the seven seeded zones (Kampala Metro,
Central Uganda (Rest), Eastern, Southern, Western, Northern, and the
Rest of Uganda fallback) and their distance-graduated pricing instead
of the old two-zone (Kampala vs. flat "Rest of Uganda") model.
Regenerated every touched .md's .docx twin to match.

Co-Authored-By: Claude Sonnet 5 <noreply@anthropic.com>
</commit_message>
<xml_diff>
--- a/docs/00-documentation-index.docx
+++ b/docs/00-documentation-index.docx
@@ -3062,7 +3062,17 @@
         <w:t>GET /shipping/quote</w:t>
       </w:r>
       <w:r>
-        <w:t xml:space="preserve"> lets the storefront show live prices as the customer types their city. Per user decision, Same-day is priced higher outside Kampala rather than hard-blocked there. See FR-5.4a in </w:t>
+        <w:t xml:space="preserve"> lets the storefront show live prices as the customer types their city. Seeded with seven zones (per explicit user correction — Central/Eastern/Western/Northern/Southern must each price differently, not share one flat "upcountry" rate), scaled by rough real-world distance from the Kampala warehouse: Kampala Metro (cheapest) → Central Uganda (Rest) → Eastern → Southern → Western → Northern (farthest, most expensive, and the one zone with no Same-day option at all — realistically 5-8 hours' drive one way) → Rest of Uganda (the </w:t>
+      </w:r>
+      <w:r>
+        <w:rPr>
+          <w:rFonts w:ascii="Consolas" w:hAnsi="Consolas"/>
+          <w:sz w:val="20"/>
+        </w:rPr>
+        <w:t>isDefault</w:t>
+      </w:r>
+      <w:r>
+        <w:t xml:space="preserve"> fallback). See FR-5.4a in </w:t>
       </w:r>
       <w:r>
         <w:rPr>

</xml_diff>